<commit_message>
Endret litt på teksten i oppgave 1, fjernet noe av koden, virket som de ikke ville ha så mye kode i besvarelsen. La inn tekst i oppgave 2 og 5
</commit_message>
<xml_diff>
--- a/Oppgave_1_ny_siste/IT3212 innlevering teskt siste.docx
+++ b/Oppgave_1_ny_siste/IT3212 innlevering teskt siste.docx
@@ -348,8 +348,13 @@
             <w:pPr>
               <w:cnfStyle w:val="000000010000" w:firstRow="0" w:lastRow="0" w:firstColumn="0" w:lastColumn="0" w:oddVBand="0" w:evenVBand="0" w:oddHBand="0" w:evenHBand="1" w:firstRowFirstColumn="0" w:firstRowLastColumn="0" w:lastRowFirstColumn="0" w:lastRowLastColumn="0"/>
             </w:pPr>
-            <w:r>
-              <w:t>Hanevik Folkestad</w:t>
+            <w:proofErr w:type="spellStart"/>
+            <w:r>
+              <w:t>Hanevik</w:t>
+            </w:r>
+            <w:proofErr w:type="spellEnd"/>
+            <w:r>
+              <w:t xml:space="preserve"> Folkestad</w:t>
             </w:r>
           </w:p>
         </w:tc>
@@ -378,6 +383,15 @@
                 <w:szCs w:val="24"/>
                 <w:lang w:val="sv-SE"/>
               </w:rPr>
+              <w:t>sindrul</w:t>
+            </w:r>
+            <w:r>
+              <w:rPr>
+                <w:rFonts w:ascii="Arial" w:eastAsia="Arial" w:hAnsi="Arial" w:cs="Arial"/>
+                <w:sz w:val="24"/>
+                <w:szCs w:val="24"/>
+                <w:lang w:val="sv-SE"/>
+              </w:rPr>
               <w:t>@stud.ntnu.no</w:t>
             </w:r>
           </w:p>
@@ -390,6 +404,9 @@
             <w:pPr>
               <w:cnfStyle w:val="000000100000" w:firstRow="0" w:lastRow="0" w:firstColumn="0" w:lastColumn="0" w:oddVBand="0" w:evenVBand="0" w:oddHBand="1" w:evenHBand="0" w:firstRowFirstColumn="0" w:firstRowLastColumn="0" w:lastRowFirstColumn="0" w:lastRowLastColumn="0"/>
             </w:pPr>
+            <w:r>
+              <w:t>Ulsaker</w:t>
+            </w:r>
           </w:p>
         </w:tc>
         <w:tc>
@@ -400,6 +417,9 @@
             <w:pPr>
               <w:cnfStyle w:val="000000100000" w:firstRow="0" w:lastRow="0" w:firstColumn="0" w:lastColumn="0" w:oddVBand="0" w:evenVBand="0" w:oddHBand="1" w:evenHBand="0" w:firstRowFirstColumn="0" w:firstRowLastColumn="0" w:lastRowFirstColumn="0" w:lastRowLastColumn="0"/>
             </w:pPr>
+            <w:r>
+              <w:t>Sindre</w:t>
+            </w:r>
           </w:p>
         </w:tc>
       </w:tr>
@@ -1052,36 +1072,6 @@
       </w:sdtContent>
     </w:sdt>
     <w:p/>
-    <w:p/>
-    <w:p/>
-    <w:p>
-      <w:pPr>
-        <w:rPr>
-          <w:lang w:val="nb-NO"/>
-        </w:rPr>
-      </w:pPr>
-    </w:p>
-    <w:p>
-      <w:pPr>
-        <w:rPr>
-          <w:lang w:val="nb-NO"/>
-        </w:rPr>
-      </w:pPr>
-    </w:p>
-    <w:p>
-      <w:pPr>
-        <w:rPr>
-          <w:lang w:val="nb-NO"/>
-        </w:rPr>
-      </w:pPr>
-    </w:p>
-    <w:p>
-      <w:pPr>
-        <w:rPr>
-          <w:lang w:val="nb-NO"/>
-        </w:rPr>
-      </w:pPr>
-    </w:p>
     <w:p>
       <w:pPr>
         <w:pStyle w:val="Overskrift1"/>
@@ -1095,6 +1085,7 @@
         <w:rPr>
           <w:lang w:val="nb-NO"/>
         </w:rPr>
+        <w:lastRenderedPageBreak/>
         <w:t>Task</w:t>
       </w:r>
       <w:proofErr w:type="spellEnd"/>
@@ -1127,13 +1118,13 @@
         <mc:AlternateContent>
           <mc:Choice Requires="wps">
             <w:drawing>
-              <wp:anchor distT="45720" distB="45720" distL="114300" distR="114300" simplePos="0" relativeHeight="251659264" behindDoc="0" locked="0" layoutInCell="1" allowOverlap="1" wp14:anchorId="67CAD445" wp14:editId="18A067F9">
+              <wp:anchor distT="45720" distB="45720" distL="114300" distR="114300" simplePos="0" relativeHeight="251659264" behindDoc="0" locked="0" layoutInCell="1" allowOverlap="1" wp14:anchorId="67CAD445" wp14:editId="380F7B28">
                 <wp:simplePos x="0" y="0"/>
                 <wp:positionH relativeFrom="margin">
-                  <wp:posOffset>3604475</wp:posOffset>
+                  <wp:align>left</wp:align>
                 </wp:positionH>
                 <wp:positionV relativeFrom="paragraph">
-                  <wp:posOffset>1226937</wp:posOffset>
+                  <wp:posOffset>626319</wp:posOffset>
                 </wp:positionV>
                 <wp:extent cx="2053193" cy="217575"/>
                 <wp:effectExtent l="0" t="0" r="23495" b="11430"/>
@@ -1229,7 +1220,7 @@
                 <v:stroke joinstyle="miter"/>
                 <v:path gradientshapeok="t" o:connecttype="rect"/>
               </v:shapetype>
-              <v:shape id="Tekstboks 2" o:spid="_x0000_s1026" type="#_x0000_t202" style="position:absolute;margin-left:283.8pt;margin-top:96.6pt;width:161.65pt;height:17.15pt;z-index:251659264;visibility:visible;mso-wrap-style:square;mso-width-percent:0;mso-height-percent:0;mso-wrap-distance-left:9pt;mso-wrap-distance-top:3.6pt;mso-wrap-distance-right:9pt;mso-wrap-distance-bottom:3.6pt;mso-position-horizontal:absolute;mso-position-horizontal-relative:margin;mso-position-vertical:absolute;mso-position-vertical-relative:text;mso-width-percent:0;mso-height-percent:0;mso-width-relative:margin;mso-height-relative:margin;v-text-anchor:top" o:gfxdata="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">
+              <v:shape id="Tekstboks 2" o:spid="_x0000_s1026" type="#_x0000_t202" style="position:absolute;margin-left:0;margin-top:49.3pt;width:161.65pt;height:17.15pt;z-index:251659264;visibility:visible;mso-wrap-style:square;mso-width-percent:0;mso-height-percent:0;mso-wrap-distance-left:9pt;mso-wrap-distance-top:3.6pt;mso-wrap-distance-right:9pt;mso-wrap-distance-bottom:3.6pt;mso-position-horizontal:left;mso-position-horizontal-relative:margin;mso-position-vertical:absolute;mso-position-vertical-relative:text;mso-width-percent:0;mso-height-percent:0;mso-width-relative:margin;mso-height-relative:margin;v-text-anchor:top" o:gfxdata="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">
                 <v:textbox>
                   <w:txbxContent>
                     <w:p>
@@ -1281,10 +1272,10 @@
           <w:noProof/>
         </w:rPr>
         <w:drawing>
-          <wp:inline distT="0" distB="0" distL="0" distR="0" wp14:anchorId="38C70E23" wp14:editId="6654A2BE">
-            <wp:extent cx="5687063" cy="1178061"/>
-            <wp:effectExtent l="0" t="0" r="0" b="3175"/>
-            <wp:docPr id="728304507" name="Bilde 1" descr="Et bilde som inneholder keyboard, tekst, Kontorutstyr, skjermbilde&#10;&#10;KI-generert innhold kan være feil."/>
+          <wp:inline distT="0" distB="0" distL="0" distR="0" wp14:anchorId="61A2A59A" wp14:editId="6AF09600">
+            <wp:extent cx="6116320" cy="604520"/>
+            <wp:effectExtent l="0" t="0" r="0" b="5080"/>
+            <wp:docPr id="1971593418" name="Bilde 1"/>
             <wp:cNvGraphicFramePr>
               <a:graphicFrameLocks xmlns:a="http://schemas.openxmlformats.org/drawingml/2006/main" noChangeAspect="1"/>
             </wp:cNvGraphicFramePr>
@@ -1292,7 +1283,7 @@
               <a:graphicData uri="http://schemas.openxmlformats.org/drawingml/2006/picture">
                 <pic:pic xmlns:pic="http://schemas.openxmlformats.org/drawingml/2006/picture">
                   <pic:nvPicPr>
-                    <pic:cNvPr id="728304507" name="Bilde 1" descr="Et bilde som inneholder keyboard, tekst, Kontorutstyr, skjermbilde&#10;&#10;KI-generert innhold kan være feil."/>
+                    <pic:cNvPr id="1971593418" name=""/>
                     <pic:cNvPicPr/>
                   </pic:nvPicPr>
                   <pic:blipFill>
@@ -1304,7 +1295,7 @@
                   <pic:spPr>
                     <a:xfrm>
                       <a:off x="0" y="0"/>
-                      <a:ext cx="5766054" cy="1194424"/>
+                      <a:ext cx="6116320" cy="604520"/>
                     </a:xfrm>
                     <a:prstGeom prst="rect">
                       <a:avLst/>
@@ -1332,15 +1323,15 @@
         <mc:AlternateContent>
           <mc:Choice Requires="wps">
             <w:drawing>
-              <wp:anchor distT="45720" distB="45720" distL="114300" distR="114300" simplePos="0" relativeHeight="251663360" behindDoc="0" locked="0" layoutInCell="1" allowOverlap="1" wp14:anchorId="00DB9E41" wp14:editId="62331622">
+              <wp:anchor distT="45720" distB="45720" distL="114300" distR="114300" simplePos="0" relativeHeight="251663360" behindDoc="0" locked="0" layoutInCell="1" allowOverlap="1" wp14:anchorId="00DB9E41" wp14:editId="339B6ACF">
                 <wp:simplePos x="0" y="0"/>
                 <wp:positionH relativeFrom="margin">
-                  <wp:posOffset>3528574</wp:posOffset>
+                  <wp:posOffset>3491256</wp:posOffset>
                 </wp:positionH>
                 <wp:positionV relativeFrom="paragraph">
-                  <wp:posOffset>3406405</wp:posOffset>
+                  <wp:posOffset>3537382</wp:posOffset>
                 </wp:positionV>
-                <wp:extent cx="2053193" cy="217575"/>
+                <wp:extent cx="2052955" cy="217170"/>
                 <wp:effectExtent l="0" t="0" r="23495" b="11430"/>
                 <wp:wrapNone/>
                 <wp:docPr id="1147096" name="Tekstboks 2"/>
@@ -1356,7 +1347,7 @@
                       <wps:spPr bwMode="auto">
                         <a:xfrm>
                           <a:off x="0" y="0"/>
-                          <a:ext cx="2053193" cy="217575"/>
+                          <a:ext cx="2052955" cy="217170"/>
                         </a:xfrm>
                         <a:prstGeom prst="rect">
                           <a:avLst/>
@@ -1448,7 +1439,7 @@
           </mc:Choice>
           <mc:Fallback>
             <w:pict>
-              <v:shape w14:anchorId="00DB9E41" id="_x0000_s1027" type="#_x0000_t202" style="position:absolute;margin-left:277.85pt;margin-top:268.2pt;width:161.65pt;height:17.15pt;z-index:251663360;visibility:visible;mso-wrap-style:square;mso-width-percent:0;mso-height-percent:0;mso-wrap-distance-left:9pt;mso-wrap-distance-top:3.6pt;mso-wrap-distance-right:9pt;mso-wrap-distance-bottom:3.6pt;mso-position-horizontal:absolute;mso-position-horizontal-relative:margin;mso-position-vertical:absolute;mso-position-vertical-relative:text;mso-width-percent:0;mso-height-percent:0;mso-width-relative:margin;mso-height-relative:margin;v-text-anchor:top" o:gfxdata="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">
+              <v:shape w14:anchorId="00DB9E41" id="_x0000_s1027" type="#_x0000_t202" style="position:absolute;margin-left:274.9pt;margin-top:278.55pt;width:161.65pt;height:17.1pt;z-index:251663360;visibility:visible;mso-wrap-style:square;mso-width-percent:0;mso-height-percent:0;mso-wrap-distance-left:9pt;mso-wrap-distance-top:3.6pt;mso-wrap-distance-right:9pt;mso-wrap-distance-bottom:3.6pt;mso-position-horizontal:absolute;mso-position-horizontal-relative:margin;mso-position-vertical:absolute;mso-position-vertical-relative:text;mso-width-percent:0;mso-height-percent:0;mso-width-relative:margin;mso-height-relative:margin;v-text-anchor:top" o:gfxdata="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">
                 <v:textbox>
                   <w:txbxContent>
                     <w:p>
@@ -1521,15 +1512,15 @@
         <mc:AlternateContent>
           <mc:Choice Requires="wps">
             <w:drawing>
-              <wp:anchor distT="45720" distB="45720" distL="114300" distR="114300" simplePos="0" relativeHeight="251661312" behindDoc="0" locked="0" layoutInCell="1" allowOverlap="1" wp14:anchorId="32C89B34" wp14:editId="7EDE0F80">
+              <wp:anchor distT="45720" distB="45720" distL="114300" distR="114300" simplePos="0" relativeHeight="251661312" behindDoc="0" locked="0" layoutInCell="1" allowOverlap="1" wp14:anchorId="32C89B34" wp14:editId="68266B8A">
                 <wp:simplePos x="0" y="0"/>
                 <wp:positionH relativeFrom="margin">
                   <wp:align>left</wp:align>
                 </wp:positionH>
                 <wp:positionV relativeFrom="paragraph">
-                  <wp:posOffset>3380721</wp:posOffset>
+                  <wp:posOffset>3591560</wp:posOffset>
                 </wp:positionV>
-                <wp:extent cx="2053193" cy="217575"/>
+                <wp:extent cx="2052955" cy="217170"/>
                 <wp:effectExtent l="0" t="0" r="23495" b="11430"/>
                 <wp:wrapNone/>
                 <wp:docPr id="1023509799" name="Tekstboks 2"/>
@@ -1545,7 +1536,7 @@
                       <wps:spPr bwMode="auto">
                         <a:xfrm>
                           <a:off x="0" y="0"/>
-                          <a:ext cx="2053193" cy="217575"/>
+                          <a:ext cx="2052955" cy="217170"/>
                         </a:xfrm>
                         <a:prstGeom prst="rect">
                           <a:avLst/>
@@ -1637,7 +1628,7 @@
           </mc:Choice>
           <mc:Fallback>
             <w:pict>
-              <v:shape w14:anchorId="32C89B34" id="_x0000_s1028" type="#_x0000_t202" style="position:absolute;margin-left:0;margin-top:266.2pt;width:161.65pt;height:17.15pt;z-index:251661312;visibility:visible;mso-wrap-style:square;mso-width-percent:0;mso-height-percent:0;mso-wrap-distance-left:9pt;mso-wrap-distance-top:3.6pt;mso-wrap-distance-right:9pt;mso-wrap-distance-bottom:3.6pt;mso-position-horizontal:left;mso-position-horizontal-relative:margin;mso-position-vertical:absolute;mso-position-vertical-relative:text;mso-width-percent:0;mso-height-percent:0;mso-width-relative:margin;mso-height-relative:margin;v-text-anchor:top" o:gfxdata="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">
+              <v:shape w14:anchorId="32C89B34" id="_x0000_s1028" type="#_x0000_t202" style="position:absolute;margin-left:0;margin-top:282.8pt;width:161.65pt;height:17.1pt;z-index:251661312;visibility:visible;mso-wrap-style:square;mso-width-percent:0;mso-height-percent:0;mso-wrap-distance-left:9pt;mso-wrap-distance-top:3.6pt;mso-wrap-distance-right:9pt;mso-wrap-distance-bottom:3.6pt;mso-position-horizontal:left;mso-position-horizontal-relative:margin;mso-position-vertical:absolute;mso-position-vertical-relative:text;mso-width-percent:0;mso-height-percent:0;mso-width-relative:margin;mso-height-relative:margin;v-text-anchor:top" o:gfxdata="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">
                 <v:textbox>
                   <w:txbxContent>
                     <w:p>
@@ -1707,9 +1698,9 @@
           <w:noProof/>
         </w:rPr>
         <w:drawing>
-          <wp:inline distT="0" distB="0" distL="0" distR="0" wp14:anchorId="60A32D53" wp14:editId="7BD37AD5">
-            <wp:extent cx="3331860" cy="3325561"/>
-            <wp:effectExtent l="0" t="0" r="1905" b="8255"/>
+          <wp:inline distT="0" distB="0" distL="0" distR="0" wp14:anchorId="60A32D53" wp14:editId="2E0BE543">
+            <wp:extent cx="3557587" cy="3550861"/>
+            <wp:effectExtent l="0" t="0" r="5080" b="0"/>
             <wp:docPr id="1877214309" name="Bilde 1" descr="Et bilde som inneholder tekst, skjermbilde, meny, sort og hvit&#10;&#10;KI-generert innhold kan være feil."/>
             <wp:cNvGraphicFramePr>
               <a:graphicFrameLocks xmlns:a="http://schemas.openxmlformats.org/drawingml/2006/main" noChangeAspect="1"/>
@@ -1730,7 +1721,7 @@
                   <pic:spPr>
                     <a:xfrm>
                       <a:off x="0" y="0"/>
-                      <a:ext cx="3332482" cy="3326182"/>
+                      <a:ext cx="3574258" cy="3567501"/>
                     </a:xfrm>
                     <a:prstGeom prst="rect">
                       <a:avLst/>
@@ -1747,9 +1738,9 @@
           <w:noProof/>
         </w:rPr>
         <w:drawing>
-          <wp:inline distT="0" distB="0" distL="0" distR="0" wp14:anchorId="5FD0141D" wp14:editId="482F0DFF">
-            <wp:extent cx="2357186" cy="3347550"/>
-            <wp:effectExtent l="0" t="0" r="5080" b="5715"/>
+          <wp:inline distT="0" distB="0" distL="0" distR="0" wp14:anchorId="5FD0141D" wp14:editId="0BDFA20F">
+            <wp:extent cx="2495550" cy="3544048"/>
+            <wp:effectExtent l="0" t="0" r="0" b="0"/>
             <wp:docPr id="973979105" name="Bilde 1" descr="Et bilde som inneholder tekst, skjermbilde, meny&#10;&#10;KI-generert innhold kan være feil."/>
             <wp:cNvGraphicFramePr>
               <a:graphicFrameLocks xmlns:a="http://schemas.openxmlformats.org/drawingml/2006/main" noChangeAspect="1"/>
@@ -1770,7 +1761,7 @@
                   <pic:spPr>
                     <a:xfrm>
                       <a:off x="0" y="0"/>
-                      <a:ext cx="2368758" cy="3363984"/>
+                      <a:ext cx="2520286" cy="3579177"/>
                     </a:xfrm>
                     <a:prstGeom prst="rect">
                       <a:avLst/>
@@ -1786,7 +1777,13 @@
     <w:p/>
     <w:p>
       <w:r>
-        <w:t xml:space="preserve">Here I’ve only used standard pandas </w:t>
+        <w:t xml:space="preserve">Here </w:t>
+      </w:r>
+      <w:r>
+        <w:t>we</w:t>
+      </w:r>
+      <w:r>
+        <w:t xml:space="preserve">’ve only used standard pandas </w:t>
       </w:r>
       <w:r>
         <w:t xml:space="preserve">(pd) </w:t>
@@ -1795,8 +1792,6 @@
         <w:t>methods such as describe, info, and print.</w:t>
       </w:r>
     </w:p>
-    <w:p/>
-    <w:p/>
     <w:p/>
     <w:p>
       <w:r>
@@ -1806,51 +1801,58 @@
     <w:p>
       <w:pPr>
         <w:rPr>
+          <w:b/>
+          <w:bCs/>
+        </w:rPr>
+      </w:pPr>
+      <w:r>
+        <w:rPr>
+          <w:b/>
+          <w:bCs/>
+        </w:rPr>
+        <w:t>Identifying missing values</w:t>
+      </w:r>
+    </w:p>
+    <w:p>
+      <w:r>
+        <w:t xml:space="preserve">To check for missing values, we used </w:t>
+      </w:r>
+      <w:proofErr w:type="gramStart"/>
+      <w:r>
+        <w:t>pandas .</w:t>
+      </w:r>
+      <w:proofErr w:type="spellStart"/>
+      <w:r>
+        <w:t>isna</w:t>
+      </w:r>
+      <w:proofErr w:type="spellEnd"/>
+      <w:proofErr w:type="gramEnd"/>
+      <w:r>
+        <w:t>(</w:t>
+      </w:r>
+      <w:proofErr w:type="gramStart"/>
+      <w:r>
+        <w:t>).sum</w:t>
+      </w:r>
+      <w:proofErr w:type="gramEnd"/>
+      <w:r>
+        <w:t>() across all columns.</w:t>
+      </w:r>
+      <w:r>
+        <w:t xml:space="preserve"> </w:t>
+      </w:r>
+      <w:r>
+        <w:t>This confirmed that no missing values are present in the dataset (total count = 0).</w:t>
+      </w:r>
+    </w:p>
+    <w:p>
+      <w:pPr>
+        <w:rPr>
+          <w:b/>
+          <w:bCs/>
           <w:lang w:val="nb-NO"/>
         </w:rPr>
       </w:pPr>
-      <w:r>
-        <w:rPr>
-          <w:noProof/>
-        </w:rPr>
-        <w:drawing>
-          <wp:inline distT="0" distB="0" distL="0" distR="0" wp14:anchorId="7CE966BB" wp14:editId="34DFF959">
-            <wp:extent cx="5756910" cy="570230"/>
-            <wp:effectExtent l="0" t="0" r="0" b="1270"/>
-            <wp:docPr id="1526164747" name="Bilde 1"/>
-            <wp:cNvGraphicFramePr>
-              <a:graphicFrameLocks xmlns:a="http://schemas.openxmlformats.org/drawingml/2006/main" noChangeAspect="1"/>
-            </wp:cNvGraphicFramePr>
-            <a:graphic xmlns:a="http://schemas.openxmlformats.org/drawingml/2006/main">
-              <a:graphicData uri="http://schemas.openxmlformats.org/drawingml/2006/picture">
-                <pic:pic xmlns:pic="http://schemas.openxmlformats.org/drawingml/2006/picture">
-                  <pic:nvPicPr>
-                    <pic:cNvPr id="1526164747" name=""/>
-                    <pic:cNvPicPr/>
-                  </pic:nvPicPr>
-                  <pic:blipFill>
-                    <a:blip r:embed="rId11"/>
-                    <a:stretch>
-                      <a:fillRect/>
-                    </a:stretch>
-                  </pic:blipFill>
-                  <pic:spPr>
-                    <a:xfrm>
-                      <a:off x="0" y="0"/>
-                      <a:ext cx="5756910" cy="570230"/>
-                    </a:xfrm>
-                    <a:prstGeom prst="rect">
-                      <a:avLst/>
-                    </a:prstGeom>
-                  </pic:spPr>
-                </pic:pic>
-              </a:graphicData>
-            </a:graphic>
-          </wp:inline>
-        </w:drawing>
-      </w:r>
-    </w:p>
-    <w:p>
       <w:r>
         <w:rPr>
           <w:noProof/>
@@ -1859,15 +1861,15 @@
         <mc:AlternateContent>
           <mc:Choice Requires="wps">
             <w:drawing>
-              <wp:anchor distT="45720" distB="45720" distL="114300" distR="114300" simplePos="0" relativeHeight="251665408" behindDoc="0" locked="0" layoutInCell="1" allowOverlap="1" wp14:anchorId="382DAF46" wp14:editId="66D41CB7">
+              <wp:anchor distT="45720" distB="45720" distL="114300" distR="114300" simplePos="0" relativeHeight="251665408" behindDoc="0" locked="0" layoutInCell="1" allowOverlap="1" wp14:anchorId="382DAF46" wp14:editId="76711D40">
                 <wp:simplePos x="0" y="0"/>
                 <wp:positionH relativeFrom="margin">
                   <wp:align>left</wp:align>
                 </wp:positionH>
                 <wp:positionV relativeFrom="paragraph">
-                  <wp:posOffset>5816</wp:posOffset>
+                  <wp:posOffset>331470</wp:posOffset>
                 </wp:positionV>
-                <wp:extent cx="1795141" cy="217575"/>
+                <wp:extent cx="1794510" cy="217170"/>
                 <wp:effectExtent l="0" t="0" r="15240" b="11430"/>
                 <wp:wrapNone/>
                 <wp:docPr id="375395859" name="Tekstboks 2"/>
@@ -1883,7 +1885,7 @@
                       <wps:spPr bwMode="auto">
                         <a:xfrm>
                           <a:off x="0" y="0"/>
-                          <a:ext cx="1795141" cy="217575"/>
+                          <a:ext cx="1794510" cy="217170"/>
                         </a:xfrm>
                         <a:prstGeom prst="rect">
                           <a:avLst/>
@@ -1966,7 +1968,7 @@
           </mc:Choice>
           <mc:Fallback>
             <w:pict>
-              <v:shape w14:anchorId="382DAF46" id="_x0000_s1029" type="#_x0000_t202" style="position:absolute;margin-left:0;margin-top:.45pt;width:141.35pt;height:17.15pt;z-index:251665408;visibility:visible;mso-wrap-style:square;mso-width-percent:0;mso-height-percent:0;mso-wrap-distance-left:9pt;mso-wrap-distance-top:3.6pt;mso-wrap-distance-right:9pt;mso-wrap-distance-bottom:3.6pt;mso-position-horizontal:left;mso-position-horizontal-relative:margin;mso-position-vertical:absolute;mso-position-vertical-relative:text;mso-width-percent:0;mso-height-percent:0;mso-width-relative:margin;mso-height-relative:margin;v-text-anchor:top" o:gfxdata="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">
+              <v:shape w14:anchorId="382DAF46" id="_x0000_s1029" type="#_x0000_t202" style="position:absolute;margin-left:0;margin-top:26.1pt;width:141.3pt;height:17.1pt;z-index:251665408;visibility:visible;mso-wrap-style:square;mso-width-percent:0;mso-height-percent:0;mso-wrap-distance-left:9pt;mso-wrap-distance-top:3.6pt;mso-wrap-distance-right:9pt;mso-wrap-distance-bottom:3.6pt;mso-position-horizontal:left;mso-position-horizontal-relative:margin;mso-position-vertical:absolute;mso-position-vertical-relative:text;mso-width-percent:0;mso-height-percent:0;mso-width-relative:margin;mso-height-relative:margin;v-text-anchor:top" o:gfxdata="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">
                 <v:textbox>
                   <w:txbxContent>
                     <w:p>
@@ -2022,6 +2024,58 @@
           </mc:Fallback>
         </mc:AlternateContent>
       </w:r>
+      <w:r>
+        <w:rPr>
+          <w:b/>
+          <w:bCs/>
+          <w:noProof/>
+          <w:lang w:val="nb-NO"/>
+        </w:rPr>
+        <w:drawing>
+          <wp:inline distT="0" distB="0" distL="0" distR="0" wp14:anchorId="67673A53" wp14:editId="7E357C35">
+            <wp:extent cx="1790950" cy="295316"/>
+            <wp:effectExtent l="0" t="0" r="0" b="9525"/>
+            <wp:docPr id="775437414" name="Bilde 1"/>
+            <wp:cNvGraphicFramePr>
+              <a:graphicFrameLocks xmlns:a="http://schemas.openxmlformats.org/drawingml/2006/main" noChangeAspect="1"/>
+            </wp:cNvGraphicFramePr>
+            <a:graphic xmlns:a="http://schemas.openxmlformats.org/drawingml/2006/main">
+              <a:graphicData uri="http://schemas.openxmlformats.org/drawingml/2006/picture">
+                <pic:pic xmlns:pic="http://schemas.openxmlformats.org/drawingml/2006/picture">
+                  <pic:nvPicPr>
+                    <pic:cNvPr id="775437414" name=""/>
+                    <pic:cNvPicPr/>
+                  </pic:nvPicPr>
+                  <pic:blipFill>
+                    <a:blip r:embed="rId11"/>
+                    <a:stretch>
+                      <a:fillRect/>
+                    </a:stretch>
+                  </pic:blipFill>
+                  <pic:spPr>
+                    <a:xfrm>
+                      <a:off x="0" y="0"/>
+                      <a:ext cx="1790950" cy="295316"/>
+                    </a:xfrm>
+                    <a:prstGeom prst="rect">
+                      <a:avLst/>
+                    </a:prstGeom>
+                  </pic:spPr>
+                </pic:pic>
+              </a:graphicData>
+            </a:graphic>
+          </wp:inline>
+        </w:drawing>
+      </w:r>
+    </w:p>
+    <w:p/>
+    <w:p>
+      <w:pPr>
+        <w:rPr>
+          <w:b/>
+          <w:bCs/>
+        </w:rPr>
+      </w:pPr>
     </w:p>
     <w:p>
       <w:pPr>
@@ -2031,75 +2085,77 @@
         </w:rPr>
       </w:pPr>
       <w:r>
-        <w:t>We can see in Figure 4 that we do not have any missing values in our dataset. (The code is included so you can see that it was done correctly.)</w:t>
+        <w:rPr>
+          <w:b/>
+          <w:bCs/>
+        </w:rPr>
+        <w:t>Identifying duplicates</w:t>
       </w:r>
     </w:p>
-    <w:p/>
     <w:p>
       <w:r>
-        <w:t xml:space="preserve">When checking the dataset </w:t>
-      </w:r>
-      <w:r>
-        <w:t xml:space="preserve">we found </w:t>
-      </w:r>
-      <w:r>
-        <w:t>duplicat</w:t>
-      </w:r>
-      <w:r>
-        <w:t>es (</w:t>
-      </w:r>
-      <w:proofErr w:type="spellStart"/>
+        <w:lastRenderedPageBreak/>
+        <w:t xml:space="preserve">We checked for duplicate rows using the </w:t>
+      </w:r>
       <w:proofErr w:type="gramStart"/>
       <w:r>
-        <w:t>np.</w:t>
-      </w:r>
-      <w:r>
-        <w:t>duplicated</w:t>
-      </w:r>
-      <w:proofErr w:type="spellEnd"/>
+        <w:t>duplicated(</w:t>
+      </w:r>
       <w:proofErr w:type="gramEnd"/>
       <w:r>
-        <w:t>()).</w:t>
-      </w:r>
-      <w:r>
-        <w:t xml:space="preserve"> </w:t>
-      </w:r>
-      <w:r>
-        <w:t>We</w:t>
-      </w:r>
-      <w:r>
-        <w:t xml:space="preserve"> found that there are a small number of rows that are completely identical across all variables. In practice, it is extremely unlikely that two different individuals would have </w:t>
+        <w:t>) function in pandas. This revealed a small number of records that were identical across all variables. I</w:t>
+      </w:r>
+      <w:r>
+        <w:t>t is extremely unlikely that two different individuals would have the same values for every single measurement</w:t>
+      </w:r>
+      <w:r>
+        <w:t xml:space="preserve">, and since the dataset does not contain a unique identifier or a timestamp, we interpret these rows as accidental double registrations. </w:t>
+      </w:r>
+      <w:r>
+        <w:t>D</w:t>
+      </w:r>
+      <w:r>
+        <w:t xml:space="preserve">uplicates would cause some data points to be weighted more heavily than </w:t>
       </w:r>
       <w:proofErr w:type="gramStart"/>
       <w:r>
-        <w:t>exactly the same</w:t>
+        <w:t>others</w:t>
+      </w:r>
+      <w:r>
+        <w:t xml:space="preserve">, </w:t>
+      </w:r>
+      <w:r>
+        <w:t>and</w:t>
       </w:r>
       <w:proofErr w:type="gramEnd"/>
       <w:r>
-        <w:t xml:space="preserve"> values for every single measurement (blood pressure, cholesterol levels, eyesight, hearing, etc.). Therefore, such duplicates are most likely the result of double registrations in the dataset</w:t>
-      </w:r>
-      <w:r>
-        <w:t xml:space="preserve"> (</w:t>
-      </w:r>
-      <w:r>
-        <w:t>extremely unlikely</w:t>
-      </w:r>
-      <w:r>
-        <w:t>)</w:t>
-      </w:r>
-      <w:r>
-        <w:t xml:space="preserve">. Since duplicates would otherwise cause some data points to be weighted more heavily than others, we removed them </w:t>
-      </w:r>
-      <w:r>
-        <w:t xml:space="preserve">as cleaning. If the data included a time stamp for the </w:t>
+        <w:t xml:space="preserve"> could even introduce data leakage if duplicates ended up on both sides of the train–test split</w:t>
+      </w:r>
+      <w:r>
+        <w:t xml:space="preserve">. </w:t>
       </w:r>
       <w:proofErr w:type="gramStart"/>
       <w:r>
-        <w:t>test</w:t>
+        <w:t>Therefore</w:t>
       </w:r>
       <w:proofErr w:type="gramEnd"/>
       <w:r>
-        <w:t xml:space="preserve"> we would know for sure. </w:t>
+        <w:t xml:space="preserve"> w</w:t>
+      </w:r>
+      <w:r>
+        <w:t xml:space="preserve">e removed them before further preprocessing. We </w:t>
+      </w:r>
+      <w:r>
+        <w:t xml:space="preserve">can see in figure 5 that we </w:t>
+      </w:r>
+      <w:r>
+        <w:t xml:space="preserve">found </w:t>
+      </w:r>
+      <w:r>
+        <w:t>26 duplicated rows</w:t>
+      </w:r>
+      <w:r>
+        <w:t>.</w:t>
       </w:r>
     </w:p>
     <w:p>
@@ -2116,13 +2172,13 @@
         <mc:AlternateContent>
           <mc:Choice Requires="wps">
             <w:drawing>
-              <wp:anchor distT="45720" distB="45720" distL="114300" distR="114300" simplePos="0" relativeHeight="251667456" behindDoc="0" locked="0" layoutInCell="1" allowOverlap="1" wp14:anchorId="42946882" wp14:editId="42D158C1">
+              <wp:anchor distT="45720" distB="45720" distL="114300" distR="114300" simplePos="0" relativeHeight="251667456" behindDoc="0" locked="0" layoutInCell="1" allowOverlap="1" wp14:anchorId="42946882" wp14:editId="5EC6831B">
                 <wp:simplePos x="0" y="0"/>
                 <wp:positionH relativeFrom="margin">
                   <wp:align>left</wp:align>
                 </wp:positionH>
                 <wp:positionV relativeFrom="paragraph">
-                  <wp:posOffset>1298508</wp:posOffset>
+                  <wp:posOffset>520018</wp:posOffset>
                 </wp:positionV>
                 <wp:extent cx="1795141" cy="217575"/>
                 <wp:effectExtent l="0" t="0" r="15240" b="11430"/>
@@ -2182,7 +2238,7 @@
                                 <w:sz w:val="16"/>
                                 <w:szCs w:val="16"/>
                               </w:rPr>
-                              <w:t>6</w:t>
+                              <w:t>5</w:t>
                             </w:r>
                             <w:r>
                               <w:rPr>
@@ -2200,25 +2256,7 @@
                                 <w:sz w:val="16"/>
                                 <w:szCs w:val="16"/>
                               </w:rPr>
-                              <w:t xml:space="preserve">Identify </w:t>
-                            </w:r>
-                            <w:r>
-                              <w:rPr>
-                                <w:b/>
-                                <w:bCs/>
-                                <w:sz w:val="16"/>
-                                <w:szCs w:val="16"/>
-                              </w:rPr>
-                              <w:t>duplicated</w:t>
-                            </w:r>
-                            <w:r>
-                              <w:rPr>
-                                <w:b/>
-                                <w:bCs/>
-                                <w:sz w:val="16"/>
-                                <w:szCs w:val="16"/>
-                              </w:rPr>
-                              <w:t xml:space="preserve"> values</w:t>
+                              <w:t>duplicated rows</w:t>
                             </w:r>
                           </w:p>
                           <w:p/>
@@ -2241,7 +2279,7 @@
           </mc:Choice>
           <mc:Fallback>
             <w:pict>
-              <v:shape w14:anchorId="42946882" id="_x0000_s1030" type="#_x0000_t202" style="position:absolute;margin-left:0;margin-top:102.25pt;width:141.35pt;height:17.15pt;z-index:251667456;visibility:visible;mso-wrap-style:square;mso-width-percent:0;mso-height-percent:0;mso-wrap-distance-left:9pt;mso-wrap-distance-top:3.6pt;mso-wrap-distance-right:9pt;mso-wrap-distance-bottom:3.6pt;mso-position-horizontal:left;mso-position-horizontal-relative:margin;mso-position-vertical:absolute;mso-position-vertical-relative:text;mso-width-percent:0;mso-height-percent:0;mso-width-relative:margin;mso-height-relative:margin;v-text-anchor:top" o:gfxdata="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">
+              <v:shape w14:anchorId="42946882" id="_x0000_s1030" type="#_x0000_t202" style="position:absolute;margin-left:0;margin-top:40.95pt;width:141.35pt;height:17.15pt;z-index:251667456;visibility:visible;mso-wrap-style:square;mso-width-percent:0;mso-height-percent:0;mso-wrap-distance-left:9pt;mso-wrap-distance-top:3.6pt;mso-wrap-distance-right:9pt;mso-wrap-distance-bottom:3.6pt;mso-position-horizontal:left;mso-position-horizontal-relative:margin;mso-position-vertical:absolute;mso-position-vertical-relative:text;mso-width-percent:0;mso-height-percent:0;mso-width-relative:margin;mso-height-relative:margin;v-text-anchor:top" o:gfxdata="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">
                 <v:textbox>
                   <w:txbxContent>
                     <w:p>
@@ -2267,7 +2305,7 @@
                           <w:sz w:val="16"/>
                           <w:szCs w:val="16"/>
                         </w:rPr>
-                        <w:t>6</w:t>
+                        <w:t>5</w:t>
                       </w:r>
                       <w:r>
                         <w:rPr>
@@ -2285,25 +2323,7 @@
                           <w:sz w:val="16"/>
                           <w:szCs w:val="16"/>
                         </w:rPr>
-                        <w:t xml:space="preserve">Identify </w:t>
-                      </w:r>
-                      <w:r>
-                        <w:rPr>
-                          <w:b/>
-                          <w:bCs/>
-                          <w:sz w:val="16"/>
-                          <w:szCs w:val="16"/>
-                        </w:rPr>
-                        <w:t>duplicated</w:t>
-                      </w:r>
-                      <w:r>
-                        <w:rPr>
-                          <w:b/>
-                          <w:bCs/>
-                          <w:sz w:val="16"/>
-                          <w:szCs w:val="16"/>
-                        </w:rPr>
-                        <w:t xml:space="preserve"> values</w:t>
+                        <w:t>duplicated rows</w:t>
                       </w:r>
                     </w:p>
                     <w:p/>
@@ -2318,12 +2338,13 @@
       <w:r>
         <w:rPr>
           <w:noProof/>
+          <w:color w:val="EE0000"/>
         </w:rPr>
         <w:drawing>
-          <wp:inline distT="0" distB="0" distL="0" distR="0" wp14:anchorId="48467484" wp14:editId="2F6F2193">
-            <wp:extent cx="5756910" cy="1293495"/>
-            <wp:effectExtent l="0" t="0" r="0" b="1905"/>
-            <wp:docPr id="1792915758" name="Bilde 1" descr="Et bilde som inneholder tekst, skjermbilde, Font, programvare&#10;&#10;KI-generert innhold kan være feil."/>
+          <wp:inline distT="0" distB="0" distL="0" distR="0" wp14:anchorId="006BF6F9" wp14:editId="48EE5CD6">
+            <wp:extent cx="3200847" cy="447737"/>
+            <wp:effectExtent l="0" t="0" r="0" b="0"/>
+            <wp:docPr id="1715079305" name="Bilde 1"/>
             <wp:cNvGraphicFramePr>
               <a:graphicFrameLocks xmlns:a="http://schemas.openxmlformats.org/drawingml/2006/main" noChangeAspect="1"/>
             </wp:cNvGraphicFramePr>
@@ -2331,7 +2352,7 @@
               <a:graphicData uri="http://schemas.openxmlformats.org/drawingml/2006/picture">
                 <pic:pic xmlns:pic="http://schemas.openxmlformats.org/drawingml/2006/picture">
                   <pic:nvPicPr>
-                    <pic:cNvPr id="1792915758" name="Bilde 1" descr="Et bilde som inneholder tekst, skjermbilde, Font, programvare&#10;&#10;KI-generert innhold kan være feil."/>
+                    <pic:cNvPr id="1715079305" name=""/>
                     <pic:cNvPicPr/>
                   </pic:nvPicPr>
                   <pic:blipFill>
@@ -2343,7 +2364,7 @@
                   <pic:spPr>
                     <a:xfrm>
                       <a:off x="0" y="0"/>
-                      <a:ext cx="5756910" cy="1293495"/>
+                      <a:ext cx="3200847" cy="447737"/>
                     </a:xfrm>
                     <a:prstGeom prst="rect">
                       <a:avLst/>
@@ -2364,6 +2385,28 @@
       </w:pPr>
     </w:p>
     <w:p>
+      <w:pPr>
+        <w:rPr>
+          <w:color w:val="EE0000"/>
+        </w:rPr>
+      </w:pPr>
+    </w:p>
+    <w:p>
+      <w:pPr>
+        <w:rPr>
+          <w:b/>
+          <w:bCs/>
+        </w:rPr>
+      </w:pPr>
+      <w:r>
+        <w:rPr>
+          <w:b/>
+          <w:bCs/>
+        </w:rPr>
+        <w:t>Identifying outliers</w:t>
+      </w:r>
+    </w:p>
+    <w:p>
       <w:r>
         <w:t xml:space="preserve">To identify potential outliers, we visualized the features using boxplots and histograms. </w:t>
       </w:r>
@@ -2393,9 +2436,9 @@
         <w:tblLook w:val="04A0" w:firstRow="1" w:lastRow="0" w:firstColumn="1" w:lastColumn="0" w:noHBand="0" w:noVBand="1"/>
       </w:tblPr>
       <w:tblGrid>
-        <w:gridCol w:w="3273"/>
-        <w:gridCol w:w="2934"/>
-        <w:gridCol w:w="2849"/>
+        <w:gridCol w:w="3454"/>
+        <w:gridCol w:w="3096"/>
+        <w:gridCol w:w="3006"/>
       </w:tblGrid>
       <w:tr>
         <w:tc>
@@ -2407,7 +2450,6 @@
               <w:rPr>
                 <w:noProof/>
               </w:rPr>
-              <w:lastRenderedPageBreak/>
               <w:drawing>
                 <wp:inline distT="0" distB="0" distL="0" distR="0" wp14:anchorId="773A493A" wp14:editId="5FE37481">
                   <wp:extent cx="1650263" cy="1643676"/>
@@ -2628,6 +2670,7 @@
               <w:rPr>
                 <w:noProof/>
               </w:rPr>
+              <w:lastRenderedPageBreak/>
               <w:drawing>
                 <wp:inline distT="0" distB="0" distL="0" distR="0" wp14:anchorId="6E1308B1" wp14:editId="50178CE1">
                   <wp:extent cx="1767092" cy="2750662"/>
@@ -2677,14 +2720,7 @@
                 <w:sz w:val="18"/>
                 <w:szCs w:val="18"/>
               </w:rPr>
-              <w:t xml:space="preserve">The waistline variable shows a strong concentration of values in a realistic range (around 70–100 cm), but the boxplot also reveals extreme outliers, including values above 1000 cm, which are clearly unrealistic </w:t>
-            </w:r>
-            <w:r>
-              <w:rPr>
-                <w:sz w:val="18"/>
-                <w:szCs w:val="18"/>
-              </w:rPr>
-              <w:t xml:space="preserve">(I looked up the world record and it 302cm so clearly this is a typo of some sort) </w:t>
+              <w:t xml:space="preserve">The waistline variable shows a strong concentration of values in a realistic range (around 70–100 cm), but the boxplot also reveals extreme outliers, including values above 1000 cm, which are clearly unrealistic (I looked up the world record and it 302cm so clearly this is a typo of some sort) </w:t>
             </w:r>
           </w:p>
         </w:tc>
@@ -2862,40 +2898,24 @@
                 <w:sz w:val="18"/>
                 <w:szCs w:val="18"/>
               </w:rPr>
-              <w:t xml:space="preserve">Same as </w:t>
-            </w:r>
-            <w:proofErr w:type="spellStart"/>
+              <w:t xml:space="preserve">Same </w:t>
+            </w:r>
             <w:r>
               <w:rPr>
                 <w:sz w:val="18"/>
                 <w:szCs w:val="18"/>
               </w:rPr>
-              <w:t>sight_left</w:t>
-            </w:r>
-            <w:proofErr w:type="spellEnd"/>
+              <w:t xml:space="preserve">as </w:t>
+            </w:r>
+            <w:proofErr w:type="spellStart"/>
             <w:r>
               <w:rPr>
                 <w:sz w:val="18"/>
                 <w:szCs w:val="18"/>
               </w:rPr>
-              <w:t xml:space="preserve"> but for </w:t>
-            </w:r>
-            <w:proofErr w:type="gramStart"/>
-            <w:r>
-              <w:rPr>
-                <w:sz w:val="18"/>
-                <w:szCs w:val="18"/>
-              </w:rPr>
-              <w:t>other</w:t>
-            </w:r>
-            <w:proofErr w:type="gramEnd"/>
-            <w:r>
-              <w:rPr>
-                <w:sz w:val="18"/>
-                <w:szCs w:val="18"/>
-              </w:rPr>
-              <w:t xml:space="preserve"> eye</w:t>
-            </w:r>
+              <w:t>sight_left</w:t>
+            </w:r>
+            <w:proofErr w:type="spellEnd"/>
           </w:p>
         </w:tc>
       </w:tr>
@@ -2909,7 +2929,6 @@
               <w:rPr>
                 <w:noProof/>
               </w:rPr>
-              <w:lastRenderedPageBreak/>
               <w:drawing>
                 <wp:inline distT="0" distB="0" distL="0" distR="0" wp14:anchorId="7C4C8D1E" wp14:editId="0F37B893">
                   <wp:extent cx="1766570" cy="1169519"/>
@@ -3158,6 +3177,7 @@
               <w:rPr>
                 <w:noProof/>
               </w:rPr>
+              <w:lastRenderedPageBreak/>
               <w:drawing>
                 <wp:inline distT="0" distB="0" distL="0" distR="0" wp14:anchorId="270A40D5" wp14:editId="4C502C11">
                   <wp:extent cx="1685006" cy="2670272"/>
@@ -3359,7 +3379,6 @@
               <w:rPr>
                 <w:noProof/>
               </w:rPr>
-              <w:lastRenderedPageBreak/>
               <w:drawing>
                 <wp:inline distT="0" distB="0" distL="0" distR="0" wp14:anchorId="30F816B1" wp14:editId="25F7B050">
                   <wp:extent cx="1592960" cy="2586125"/>
@@ -3476,28 +3495,7 @@
                 <w:sz w:val="18"/>
                 <w:szCs w:val="18"/>
               </w:rPr>
-              <w:t>DL cholesterol is typically distributed between 100–160 mg/dL.</w:t>
-            </w:r>
-            <w:r>
-              <w:rPr>
-                <w:sz w:val="18"/>
-                <w:szCs w:val="18"/>
-              </w:rPr>
-              <w:t xml:space="preserve"> </w:t>
-            </w:r>
-            <w:r>
-              <w:rPr>
-                <w:sz w:val="18"/>
-                <w:szCs w:val="18"/>
-              </w:rPr>
-              <w:t>but the boxplot highlights extreme outliers above 1000 mg/dL and even exceeding 5000 mg/dL</w:t>
-            </w:r>
-            <w:r>
-              <w:rPr>
-                <w:sz w:val="18"/>
-                <w:szCs w:val="18"/>
-              </w:rPr>
-              <w:t xml:space="preserve">, which is pretty extreme  </w:t>
+              <w:t xml:space="preserve">DL cholesterol is typically distributed between 100–160 mg/dL. but the boxplot highlights extreme outliers above 1000 mg/dL and even exceeding 5000 mg/dL, which is pretty extreme  </w:t>
             </w:r>
           </w:p>
         </w:tc>
@@ -3600,6 +3598,7 @@
               <w:rPr>
                 <w:noProof/>
               </w:rPr>
+              <w:lastRenderedPageBreak/>
               <w:drawing>
                 <wp:inline distT="0" distB="0" distL="0" distR="0" wp14:anchorId="51BF5BAE" wp14:editId="0C40FF04">
                   <wp:extent cx="1774232" cy="1767092"/>
@@ -3820,7 +3819,6 @@
               <w:rPr>
                 <w:noProof/>
               </w:rPr>
-              <w:lastRenderedPageBreak/>
               <w:tab/>
             </w:r>
             <w:r>
@@ -4835,10 +4833,7 @@
         <w:t>Based on the bar plots shown above</w:t>
       </w:r>
       <w:r>
-        <w:t xml:space="preserve"> </w:t>
-      </w:r>
-      <w:r>
-        <w:t>(</w:t>
+        <w:t xml:space="preserve"> (</w:t>
       </w:r>
       <w:proofErr w:type="spellStart"/>
       <w:r>
@@ -4865,7 +4860,6 @@
       </w:pPr>
       <w:bookmarkStart w:id="2" w:name="_Toc208850136"/>
       <w:r>
-        <w:lastRenderedPageBreak/>
         <w:t>Task 2)</w:t>
       </w:r>
       <w:bookmarkEnd w:id="2"/>
@@ -4873,91 +4867,182 @@
     <w:p/>
     <w:p>
       <w:r>
-        <w:t>a)</w:t>
+        <w:t>A</w:t>
+      </w:r>
+      <w:r>
+        <w:t>)</w:t>
       </w:r>
     </w:p>
-    <w:p/>
     <w:p>
-      <w:pPr>
-        <w:rPr>
-          <w:color w:val="EE0000"/>
-          <w:lang w:val="nb-NO"/>
-        </w:rPr>
-      </w:pPr>
-      <w:r>
-        <w:rPr>
-          <w:color w:val="EE0000"/>
-          <w:lang w:val="nb-NO"/>
-        </w:rPr>
-        <w:t xml:space="preserve">(Her må vi legge til hva vi hadde gjort om vi fant </w:t>
-      </w:r>
-      <w:proofErr w:type="spellStart"/>
-      <w:r>
-        <w:rPr>
-          <w:color w:val="EE0000"/>
-          <w:lang w:val="nb-NO"/>
-        </w:rPr>
-        <w:t>missing</w:t>
-      </w:r>
-      <w:proofErr w:type="spellEnd"/>
-      <w:r>
-        <w:rPr>
-          <w:color w:val="EE0000"/>
-          <w:lang w:val="nb-NO"/>
-        </w:rPr>
+      <w:r>
+        <w:t xml:space="preserve">From Task 1b we found that the dataset contains no missing values, so no imputation or deletion was performed. If gaps appear in a later version of the data, we </w:t>
+      </w:r>
+      <w:proofErr w:type="gramStart"/>
+      <w:r>
+        <w:t>would</w:t>
+      </w:r>
+      <w:proofErr w:type="gramEnd"/>
+      <w:r>
+        <w:t xml:space="preserve"> first consider whether only a very small fraction of rows is affected. When the share is negligible</w:t>
+      </w:r>
+      <w:r>
+        <w:t xml:space="preserve">, </w:t>
+      </w:r>
+      <w:r>
+        <w:t>typically below 5%</w:t>
+      </w:r>
+      <w:r>
+        <w:t xml:space="preserve">, </w:t>
+      </w:r>
+      <w:r>
+        <w:t>and the pattern appears random, dropping those rows has minimal impact on sample size and avoids inserting guessed values. If a larger portion of rows were affected, we would impute instead of deleting to preserve information. In the opposite direction, if a single feature had a large proportion of absent entries</w:t>
+      </w:r>
+      <w:r>
+        <w:t xml:space="preserve">, </w:t>
+      </w:r>
+      <w:r>
+        <w:t>on the order of 30–40% or more</w:t>
+      </w:r>
+      <w:r>
+        <w:t xml:space="preserve">, </w:t>
+      </w:r>
+      <w:r>
+        <w:t>we would consider removing that feature rather than filling it, since heavy imputation would add noise and distort distributions. This strategy keeps the data reliable by avoiding unnecessary guesses while preserving as much real information as possible.</w:t>
+      </w:r>
+    </w:p>
+    <w:p>
+      <w:r>
+        <w:t>B)</w:t>
+      </w:r>
+    </w:p>
+    <w:p>
+      <w:r>
+        <w:t xml:space="preserve">For numerical features that are approximately normally distributed, such as height and hemoglobin, we would use the </w:t>
+      </w:r>
+      <w:proofErr w:type="gramStart"/>
+      <w:r>
+        <w:t>mean</w:t>
+      </w:r>
+      <w:proofErr w:type="gramEnd"/>
+      <w:r>
+        <w:t xml:space="preserve">. The </w:t>
+      </w:r>
+      <w:proofErr w:type="gramStart"/>
+      <w:r>
+        <w:t>mean</w:t>
+      </w:r>
+      <w:proofErr w:type="gramEnd"/>
+      <w:r>
+        <w:t xml:space="preserve"> captures the true center of a symmetric distribution, leverages all observations, and provides a stable, representative fill value</w:t>
+      </w:r>
+      <w:r>
+        <w:t xml:space="preserve">, </w:t>
+      </w:r>
+      <w:r>
+        <w:t xml:space="preserve">especially when there are few outliers. For numerical features with notable extreme values, such as triglycerides, glucose, or liver enzymes, we would use the median. </w:t>
+      </w:r>
+      <w:r>
+        <w:t>A</w:t>
+      </w:r>
+      <w:r>
+        <w:t xml:space="preserve"> few very high observations can distort the </w:t>
+      </w:r>
+      <w:proofErr w:type="gramStart"/>
+      <w:r>
+        <w:t>mean</w:t>
+      </w:r>
+      <w:proofErr w:type="gramEnd"/>
+      <w:r>
+        <w:t xml:space="preserve"> and make it unrepresentative of the typical case</w:t>
+      </w:r>
+      <w:r>
+        <w:t>.</w:t>
+      </w:r>
+      <w:r>
         <w:t xml:space="preserve"> </w:t>
       </w:r>
-      <w:proofErr w:type="spellStart"/>
-      <w:r>
-        <w:rPr>
-          <w:color w:val="EE0000"/>
-          <w:lang w:val="nb-NO"/>
-        </w:rPr>
-        <w:t>valus</w:t>
-      </w:r>
-      <w:proofErr w:type="spellEnd"/>
-      <w:r>
-        <w:rPr>
-          <w:color w:val="EE0000"/>
-          <w:lang w:val="nb-NO"/>
-        </w:rPr>
-        <w:t>, det er viktig, spurte han om det, skriv om det her</w:t>
-      </w:r>
-      <w:r>
-        <w:rPr>
-          <w:color w:val="EE0000"/>
-          <w:lang w:val="nb-NO"/>
-        </w:rPr>
-        <w:t xml:space="preserve"> utdypende</w:t>
-      </w:r>
-      <w:r>
-        <w:rPr>
-          <w:color w:val="EE0000"/>
-          <w:lang w:val="nb-NO"/>
-        </w:rPr>
-        <w:t xml:space="preserve">) </w:t>
+      <w:r>
+        <w:t>T</w:t>
+      </w:r>
+      <w:r>
+        <w:t xml:space="preserve">he </w:t>
+      </w:r>
+      <w:proofErr w:type="gramStart"/>
+      <w:r>
+        <w:t>median</w:t>
+      </w:r>
+      <w:proofErr w:type="gramEnd"/>
+      <w:r>
+        <w:t xml:space="preserve"> is robust to such extremes and better reflects </w:t>
+      </w:r>
+      <w:proofErr w:type="gramStart"/>
+      <w:r>
+        <w:t>the majority of</w:t>
+      </w:r>
+      <w:proofErr w:type="gramEnd"/>
+      <w:r>
+        <w:t xml:space="preserve"> cases. For binary and nominal categorical features, such as smoking status or hearing flags, we would use the mode so that imputed values remain valid class labels and no unrealistic in-between labels are created. An alternative is probabilistic imputation, where classes are drawn according to the observed distribution</w:t>
+      </w:r>
+      <w:r>
+        <w:t>. W</w:t>
+      </w:r>
+      <w:r>
+        <w:t>hile this preserves class proportions, we prefer the mode for stability because it avoids introducing randomness. For ordinal categorical scales, we would impute the median category (or the nearest valid level) to preserve the inherent order of the variable.</w:t>
+      </w:r>
+    </w:p>
+    <w:p>
+      <w:r>
+        <w:t>C)</w:t>
+      </w:r>
+    </w:p>
+    <w:p>
+      <w:r>
+        <w:lastRenderedPageBreak/>
+        <w:t>Deleting a very small number of rows is justified because it prevents the introduction of estimates when the loss of data is negligible</w:t>
+      </w:r>
+      <w:r>
+        <w:t>. I</w:t>
+      </w:r>
+      <w:r>
+        <w:t>mputing becomes preferable once removal would noticeably reduce the sample. The choice between mean and median follows distributional shape</w:t>
+      </w:r>
+      <w:r>
+        <w:t>.</w:t>
+      </w:r>
+      <w:r>
+        <w:t xml:space="preserve"> </w:t>
+      </w:r>
+      <w:r>
+        <w:t>T</w:t>
+      </w:r>
+      <w:r>
+        <w:t xml:space="preserve">he mean is efficient and informative for near-normal variables with few outliers, whereas the </w:t>
+      </w:r>
+      <w:proofErr w:type="gramStart"/>
+      <w:r>
+        <w:t>median</w:t>
+      </w:r>
+      <w:proofErr w:type="gramEnd"/>
+      <w:r>
+        <w:t xml:space="preserve"> is robust for skewed or heavy-tailed variables where the mean would be distorted. Using the mode for categorical variables respects the discrete nature of the classes and avoids invalid hybrid values</w:t>
+      </w:r>
+      <w:r>
+        <w:t>. P</w:t>
+      </w:r>
+      <w:r>
+        <w:t xml:space="preserve">robabilistic fills can match category proportions but add stochastic variation that is unnecessary for this assignment. Finally, to prevent data leakage and ensure fair evaluation, all imputers would be fit on the training split only and then applied to validation and test through a pipeline, </w:t>
+      </w:r>
+      <w:r>
+        <w:t>s</w:t>
+      </w:r>
+      <w:r>
+        <w:t>o that preprocessing can be repeated consistently and does not use information from the validation or test sets.</w:t>
       </w:r>
     </w:p>
     <w:p>
       <w:pPr>
         <w:pStyle w:val="Overskrift1"/>
       </w:pPr>
-    </w:p>
-    <w:p/>
-    <w:p/>
-    <w:p/>
-    <w:p/>
-    <w:p/>
-    <w:p/>
-    <w:p/>
-    <w:p/>
-    <w:p/>
-    <w:p/>
-    <w:p/>
-    <w:p>
-      <w:pPr>
-        <w:pStyle w:val="Overskrift1"/>
-      </w:pPr>
       <w:bookmarkStart w:id="3" w:name="_Toc208850137"/>
       <w:r>
         <w:t>Task 3)</w:t>
@@ -5017,19 +5102,7 @@
         <w:t xml:space="preserve"> was all </w:t>
       </w:r>
       <w:r>
-        <w:t xml:space="preserve">categorical values even </w:t>
-      </w:r>
-      <w:r>
-        <w:t>«</w:t>
-      </w:r>
-      <w:r>
-        <w:t>outliers</w:t>
-      </w:r>
-      <w:r>
-        <w:t>»</w:t>
-      </w:r>
-      <w:r>
-        <w:t xml:space="preserve"> retained.</w:t>
+        <w:t>categorical values even «outliers» retained.</w:t>
       </w:r>
       <w:r>
         <w:t xml:space="preserve"> But we also need to think about the small amount of data some of these </w:t>
@@ -5047,7 +5120,6 @@
           <w:noProof/>
           <w:lang w:val="nb-NO"/>
         </w:rPr>
-        <w:lastRenderedPageBreak/>
         <mc:AlternateContent>
           <mc:Choice Requires="wps">
             <w:drawing>
@@ -5256,10 +5328,7 @@
         <w:t>transformation</w:t>
       </w:r>
       <w:r>
-        <w:t xml:space="preserve"> </w:t>
-      </w:r>
-      <w:r>
-        <w:t xml:space="preserve">(we have </w:t>
+        <w:t xml:space="preserve"> (we have </w:t>
       </w:r>
       <w:proofErr w:type="gramStart"/>
       <w:r>
@@ -5269,86 +5338,75 @@
       <w:r>
         <w:t xml:space="preserve"> on no 0 values in </w:t>
       </w:r>
+      <w:r>
+        <w:t>data)</w:t>
+      </w:r>
+      <w:r>
+        <w:t xml:space="preserve"> to</w:t>
+      </w:r>
+      <w:r>
+        <w:t xml:space="preserve"> those with skewed distributions </w:t>
+      </w:r>
       <w:proofErr w:type="gramStart"/>
       <w:r>
-        <w:t>data)</w:t>
-      </w:r>
-      <w:r>
-        <w:t xml:space="preserve"> </w:t>
-      </w:r>
-      <w:r>
-        <w:t xml:space="preserve"> to</w:t>
+        <w:t>in order to</w:t>
       </w:r>
       <w:proofErr w:type="gramEnd"/>
       <w:r>
-        <w:t xml:space="preserve"> those with skewed distributions </w:t>
+        <w:t xml:space="preserve"> normalize them</w:t>
+      </w:r>
+      <w:r>
+        <w:t xml:space="preserve">. We can </w:t>
+      </w:r>
+      <w:r>
+        <w:t>see</w:t>
+      </w:r>
+      <w:r>
+        <w:t xml:space="preserve"> in figure 9 that this makes them normally distributed (some you need to squint your eyes)</w:t>
+      </w:r>
+      <w:r>
+        <w:t xml:space="preserve">, but data that is </w:t>
+      </w:r>
+      <w:r>
+        <w:t>already</w:t>
+      </w:r>
+      <w:r>
+        <w:t xml:space="preserve"> normally distributed we don’t use log (age height, weight, hemoglobin </w:t>
+      </w:r>
+      <w:r>
+        <w:t>etc.</w:t>
+      </w:r>
+      <w:r>
+        <w:t>)</w:t>
+      </w:r>
+      <w:r>
+        <w:t xml:space="preserve">. </w:t>
+      </w:r>
+      <w:r>
+        <w:t xml:space="preserve">Log </w:t>
+      </w:r>
+      <w:r>
+        <w:t>reduces the influence of extreme values and makes the data more suitable for statistical methods that assume normality</w:t>
+      </w:r>
+      <w:r>
+        <w:t xml:space="preserve"> (z score)</w:t>
+      </w:r>
+      <w:r>
+        <w:t xml:space="preserve">. After transformation, we applied the z-score method to identify outliers across all continuous variables. Values with |z| &gt; 3 were considered potential outliers. </w:t>
+      </w:r>
+      <w:r>
+        <w:t xml:space="preserve">The outliers </w:t>
       </w:r>
       <w:proofErr w:type="gramStart"/>
       <w:r>
-        <w:t>in order to</w:t>
+        <w:t>is</w:t>
       </w:r>
       <w:proofErr w:type="gramEnd"/>
       <w:r>
-        <w:t xml:space="preserve"> normalize them</w:t>
-      </w:r>
-      <w:r>
-        <w:t xml:space="preserve">. We can </w:t>
-      </w:r>
-      <w:proofErr w:type="spellStart"/>
-      <w:r>
-        <w:t>se</w:t>
-      </w:r>
-      <w:proofErr w:type="spellEnd"/>
-      <w:r>
-        <w:t xml:space="preserve"> in figure 9 that this makes them normally distributed (some you need to squint your eyes)</w:t>
-      </w:r>
-      <w:r>
-        <w:t xml:space="preserve">, but data that is </w:t>
-      </w:r>
-      <w:proofErr w:type="spellStart"/>
-      <w:r>
-        <w:t>allerdy</w:t>
-      </w:r>
-      <w:proofErr w:type="spellEnd"/>
-      <w:r>
-        <w:t xml:space="preserve"> </w:t>
-      </w:r>
-      <w:r>
-        <w:t>normally distributed</w:t>
-      </w:r>
-      <w:r>
-        <w:t xml:space="preserve"> we don’t </w:t>
-      </w:r>
-      <w:proofErr w:type="gramStart"/>
-      <w:r>
-        <w:t>use log</w:t>
-      </w:r>
-      <w:proofErr w:type="gramEnd"/>
-      <w:r>
-        <w:t xml:space="preserve"> (age height, weight, hemoglobin </w:t>
-      </w:r>
-      <w:proofErr w:type="spellStart"/>
-      <w:r>
-        <w:t>etc</w:t>
-      </w:r>
-      <w:proofErr w:type="spellEnd"/>
-      <w:r>
-        <w:t>)</w:t>
-      </w:r>
-      <w:r>
-        <w:t xml:space="preserve">. </w:t>
-      </w:r>
-      <w:r>
-        <w:t xml:space="preserve">Log </w:t>
-      </w:r>
-      <w:r>
-        <w:t>reduces the influence of extreme values and makes the data more suitable for statistical methods that assume normality</w:t>
-      </w:r>
-      <w:r>
-        <w:t xml:space="preserve"> (z score)</w:t>
-      </w:r>
-      <w:r>
-        <w:t>. After transformation, we applied the z-score method to identify outliers across all continuous variables. Values with |z| &gt; 3 were considered potential outliers. This approach ensures consistency across variables while still accounting for skewness in the data</w:t>
+        <w:t xml:space="preserve"> then removed. </w:t>
+      </w:r>
+      <w:r>
+        <w:t>This approach ensures consistency across variables while still accounting for skewness in the data</w:t>
       </w:r>
       <w:r>
         <w:t xml:space="preserve">. You can see the results in figure 10. </w:t>
@@ -6377,37 +6435,7 @@
                                       <w:szCs w:val="16"/>
                                       <w:lang w:val="nb-NO"/>
                                     </w:rPr>
-                                    <w:t xml:space="preserve"> </w:t>
-                                  </w:r>
-                                  <w:r>
-                                    <w:rPr>
-                                      <w:b/>
-                                      <w:bCs/>
-                                      <w:sz w:val="16"/>
-                                      <w:szCs w:val="16"/>
-                                      <w:lang w:val="nb-NO"/>
-                                    </w:rPr>
-                                    <w:t>9</w:t>
-                                  </w:r>
-                                  <w:r>
-                                    <w:rPr>
-                                      <w:b/>
-                                      <w:bCs/>
-                                      <w:sz w:val="16"/>
-                                      <w:szCs w:val="16"/>
-                                      <w:lang w:val="nb-NO"/>
-                                    </w:rPr>
-                                    <w:t xml:space="preserve">. </w:t>
-                                  </w:r>
-                                  <w:r>
-                                    <w:rPr>
-                                      <w:b/>
-                                      <w:bCs/>
-                                      <w:sz w:val="16"/>
-                                      <w:szCs w:val="16"/>
-                                      <w:lang w:val="nb-NO"/>
-                                    </w:rPr>
-                                    <w:t xml:space="preserve">log </w:t>
+                                    <w:t xml:space="preserve"> 9. log </w:t>
                                   </w:r>
                                   <w:proofErr w:type="spellStart"/>
                                   <w:r>
@@ -6512,7 +6540,6 @@
                                 <w:lang w:val="nb-NO"/>
                               </w:rPr>
                             </w:pPr>
-                            <w:proofErr w:type="spellStart"/>
                             <w:r>
                               <w:rPr>
                                 <w:b/>
@@ -6521,18 +6548,7 @@
                                 <w:szCs w:val="16"/>
                                 <w:lang w:val="nb-NO"/>
                               </w:rPr>
-                              <w:t>Figure</w:t>
-                            </w:r>
-                            <w:proofErr w:type="spellEnd"/>
-                            <w:r>
-                              <w:rPr>
-                                <w:b/>
-                                <w:bCs/>
-                                <w:sz w:val="16"/>
-                                <w:szCs w:val="16"/>
-                                <w:lang w:val="nb-NO"/>
-                              </w:rPr>
-                              <w:t xml:space="preserve"> </w:t>
+                              <w:t xml:space="preserve">Figure 9. log </w:t>
                             </w:r>
                             <w:r>
                               <w:rPr>
@@ -6542,49 +6558,7 @@
                                 <w:szCs w:val="16"/>
                                 <w:lang w:val="nb-NO"/>
                               </w:rPr>
-                              <w:t>9</w:t>
-                            </w:r>
-                            <w:r>
-                              <w:rPr>
-                                <w:b/>
-                                <w:bCs/>
-                                <w:sz w:val="16"/>
-                                <w:szCs w:val="16"/>
-                                <w:lang w:val="nb-NO"/>
-                              </w:rPr>
-                              <w:t xml:space="preserve">. </w:t>
-                            </w:r>
-                            <w:r>
-                              <w:rPr>
-                                <w:b/>
-                                <w:bCs/>
-                                <w:sz w:val="16"/>
-                                <w:szCs w:val="16"/>
-                                <w:lang w:val="nb-NO"/>
-                              </w:rPr>
-                              <w:t xml:space="preserve">log </w:t>
-                            </w:r>
-                            <w:proofErr w:type="spellStart"/>
-                            <w:r>
-                              <w:rPr>
-                                <w:b/>
-                                <w:bCs/>
-                                <w:sz w:val="16"/>
-                                <w:szCs w:val="16"/>
-                                <w:lang w:val="nb-NO"/>
-                              </w:rPr>
-                              <w:t>transformed</w:t>
-                            </w:r>
-                            <w:proofErr w:type="spellEnd"/>
-                            <w:r>
-                              <w:rPr>
-                                <w:b/>
-                                <w:bCs/>
-                                <w:sz w:val="16"/>
-                                <w:szCs w:val="16"/>
-                                <w:lang w:val="nb-NO"/>
-                              </w:rPr>
-                              <w:t xml:space="preserve"> </w:t>
+                              <w:t xml:space="preserve">transformed </w:t>
                             </w:r>
                             <w:r>
                               <w:rPr>
@@ -6615,7 +6589,6 @@
                                 <w:lang w:val="nb-NO"/>
                               </w:rPr>
                             </w:pPr>
-                            <w:proofErr w:type="spellStart"/>
                             <w:r>
                               <w:rPr>
                                 <w:b/>
@@ -6626,7 +6599,6 @@
                               </w:rPr>
                               <w:t>values</w:t>
                             </w:r>
-                            <w:proofErr w:type="spellEnd"/>
                           </w:p>
                           <w:p>
                             <w:pPr>
@@ -6790,34 +6762,7 @@
                                 <w:sz w:val="16"/>
                                 <w:szCs w:val="16"/>
                               </w:rPr>
-                              <w:t xml:space="preserve">Figure </w:t>
-                            </w:r>
-                            <w:r>
-                              <w:rPr>
-                                <w:b/>
-                                <w:bCs/>
-                                <w:sz w:val="16"/>
-                                <w:szCs w:val="16"/>
-                              </w:rPr>
-                              <w:t>10</w:t>
-                            </w:r>
-                            <w:r>
-                              <w:rPr>
-                                <w:b/>
-                                <w:bCs/>
-                                <w:sz w:val="16"/>
-                                <w:szCs w:val="16"/>
-                              </w:rPr>
-                              <w:t xml:space="preserve">. </w:t>
-                            </w:r>
-                            <w:r>
-                              <w:rPr>
-                                <w:b/>
-                                <w:bCs/>
-                                <w:sz w:val="16"/>
-                                <w:szCs w:val="16"/>
-                              </w:rPr>
-                              <w:t>data after r</w:t>
+                              <w:t>Figure 10. data after r</w:t>
                             </w:r>
                             <w:r>
                               <w:rPr>
@@ -6885,34 +6830,7 @@
                           <w:sz w:val="16"/>
                           <w:szCs w:val="16"/>
                         </w:rPr>
-                        <w:t xml:space="preserve">Figure </w:t>
-                      </w:r>
-                      <w:r>
-                        <w:rPr>
-                          <w:b/>
-                          <w:bCs/>
-                          <w:sz w:val="16"/>
-                          <w:szCs w:val="16"/>
-                        </w:rPr>
-                        <w:t>10</w:t>
-                      </w:r>
-                      <w:r>
-                        <w:rPr>
-                          <w:b/>
-                          <w:bCs/>
-                          <w:sz w:val="16"/>
-                          <w:szCs w:val="16"/>
-                        </w:rPr>
-                        <w:t xml:space="preserve">. </w:t>
-                      </w:r>
-                      <w:r>
-                        <w:rPr>
-                          <w:b/>
-                          <w:bCs/>
-                          <w:sz w:val="16"/>
-                          <w:szCs w:val="16"/>
-                        </w:rPr>
-                        <w:t>data after r</w:t>
+                        <w:t>Figure 10. data after r</w:t>
                       </w:r>
                       <w:r>
                         <w:rPr>
@@ -6996,6 +6914,13 @@
           <w:lang w:val="nb-NO"/>
         </w:rPr>
         <w:t xml:space="preserve"> </w:t>
+      </w:r>
+      <w:r>
+        <w:rPr>
+          <w:noProof/>
+          <w:lang w:val="nb-NO"/>
+        </w:rPr>
+        <w:t>squint</w:t>
       </w:r>
     </w:p>
     <w:p>
@@ -7222,7 +7147,6 @@
                           <w:lang w:val="nb-NO"/>
                         </w:rPr>
                       </w:pPr>
-                      <w:proofErr w:type="spellStart"/>
                       <w:r>
                         <w:rPr>
                           <w:b/>
@@ -7231,18 +7155,7 @@
                           <w:szCs w:val="16"/>
                           <w:lang w:val="nb-NO"/>
                         </w:rPr>
-                        <w:t>Figure</w:t>
-                      </w:r>
-                      <w:proofErr w:type="spellEnd"/>
-                      <w:r>
-                        <w:rPr>
-                          <w:b/>
-                          <w:bCs/>
-                          <w:sz w:val="16"/>
-                          <w:szCs w:val="16"/>
-                          <w:lang w:val="nb-NO"/>
-                        </w:rPr>
-                        <w:t xml:space="preserve"> </w:t>
+                        <w:t xml:space="preserve">Figure </w:t>
                       </w:r>
                       <w:r>
                         <w:rPr>
@@ -7264,7 +7177,6 @@
                         </w:rPr>
                         <w:t xml:space="preserve">. </w:t>
                       </w:r>
-                      <w:proofErr w:type="spellStart"/>
                       <w:r>
                         <w:rPr>
                           <w:b/>
@@ -7273,18 +7185,7 @@
                           <w:szCs w:val="16"/>
                           <w:lang w:val="nb-NO"/>
                         </w:rPr>
-                        <w:t>Encoded</w:t>
-                      </w:r>
-                      <w:proofErr w:type="spellEnd"/>
-                      <w:r>
-                        <w:rPr>
-                          <w:b/>
-                          <w:bCs/>
-                          <w:sz w:val="16"/>
-                          <w:szCs w:val="16"/>
-                          <w:lang w:val="nb-NO"/>
-                        </w:rPr>
-                        <w:t xml:space="preserve"> </w:t>
+                        <w:t xml:space="preserve">Encoded </w:t>
                       </w:r>
                       <w:r>
                         <w:rPr>
@@ -7315,7 +7216,6 @@
                           <w:lang w:val="nb-NO"/>
                         </w:rPr>
                       </w:pPr>
-                      <w:proofErr w:type="spellStart"/>
                       <w:r>
                         <w:rPr>
                           <w:b/>
@@ -7326,7 +7226,6 @@
                         </w:rPr>
                         <w:t>values</w:t>
                       </w:r>
-                      <w:proofErr w:type="spellEnd"/>
                     </w:p>
                     <w:p>
                       <w:pPr>
@@ -7429,7 +7328,15 @@
         <w:t>. This approach is appropriate because both variables are binary and do not require one-hot encoding. Keeping the encoding simple without introducing unnecessary additional features.</w:t>
       </w:r>
       <w:r>
-        <w:t xml:space="preserve"> You can se the result in figure 11.</w:t>
+        <w:t xml:space="preserve"> You can </w:t>
+      </w:r>
+      <w:proofErr w:type="spellStart"/>
+      <w:r>
+        <w:t>se</w:t>
+      </w:r>
+      <w:proofErr w:type="spellEnd"/>
+      <w:r>
+        <w:t xml:space="preserve"> the result in figure 11.</w:t>
       </w:r>
     </w:p>
     <w:p/>
@@ -7538,25 +7445,7 @@
                                 <w:sz w:val="16"/>
                                 <w:szCs w:val="16"/>
                               </w:rPr>
-                              <w:t xml:space="preserve">. </w:t>
-                            </w:r>
-                            <w:r>
-                              <w:rPr>
-                                <w:b/>
-                                <w:bCs/>
-                                <w:sz w:val="16"/>
-                                <w:szCs w:val="16"/>
-                              </w:rPr>
-                              <w:t>Min-Max used on</w:t>
-                            </w:r>
-                            <w:r>
-                              <w:rPr>
-                                <w:b/>
-                                <w:bCs/>
-                                <w:sz w:val="16"/>
-                                <w:szCs w:val="16"/>
-                              </w:rPr>
-                              <w:t xml:space="preserve"> data</w:t>
+                              <w:t>. Min-Max used on data</w:t>
                             </w:r>
                           </w:p>
                           <w:p>
@@ -7633,25 +7522,7 @@
                           <w:sz w:val="16"/>
                           <w:szCs w:val="16"/>
                         </w:rPr>
-                        <w:t xml:space="preserve">. </w:t>
-                      </w:r>
-                      <w:r>
-                        <w:rPr>
-                          <w:b/>
-                          <w:bCs/>
-                          <w:sz w:val="16"/>
-                          <w:szCs w:val="16"/>
-                        </w:rPr>
-                        <w:t>Min-Max used on</w:t>
-                      </w:r>
-                      <w:r>
-                        <w:rPr>
-                          <w:b/>
-                          <w:bCs/>
-                          <w:sz w:val="16"/>
-                          <w:szCs w:val="16"/>
-                        </w:rPr>
-                        <w:t xml:space="preserve"> data</w:t>
+                        <w:t>. Min-Max used on data</w:t>
                       </w:r>
                     </w:p>
                     <w:p>
@@ -7812,7 +7683,25 @@
                                 <w:sz w:val="16"/>
                                 <w:szCs w:val="16"/>
                               </w:rPr>
-                              <w:t xml:space="preserve">3. </w:t>
+                              <w:t>3.</w:t>
+                            </w:r>
+                            <w:r>
+                              <w:rPr>
+                                <w:b/>
+                                <w:bCs/>
+                                <w:sz w:val="16"/>
+                                <w:szCs w:val="16"/>
+                              </w:rPr>
+                              <w:t xml:space="preserve"> 80/20</w:t>
+                            </w:r>
+                            <w:r>
+                              <w:rPr>
+                                <w:b/>
+                                <w:bCs/>
+                                <w:sz w:val="16"/>
+                                <w:szCs w:val="16"/>
+                              </w:rPr>
+                              <w:t xml:space="preserve"> </w:t>
                             </w:r>
                             <w:proofErr w:type="spellStart"/>
                             <w:r>
@@ -7900,9 +7789,8 @@
                           <w:sz w:val="16"/>
                           <w:szCs w:val="16"/>
                         </w:rPr>
-                        <w:t xml:space="preserve">3. </w:t>
+                        <w:t>3.</w:t>
                       </w:r>
-                      <w:proofErr w:type="spellStart"/>
                       <w:r>
                         <w:rPr>
                           <w:b/>
@@ -7910,9 +7798,8 @@
                           <w:sz w:val="16"/>
                           <w:szCs w:val="16"/>
                         </w:rPr>
-                        <w:t>splitted</w:t>
+                        <w:t xml:space="preserve"> 80/20</w:t>
                       </w:r>
-                      <w:proofErr w:type="spellEnd"/>
                       <w:r>
                         <w:rPr>
                           <w:b/>
@@ -7920,7 +7807,7 @@
                           <w:sz w:val="16"/>
                           <w:szCs w:val="16"/>
                         </w:rPr>
-                        <w:t xml:space="preserve"> data </w:t>
+                        <w:t xml:space="preserve"> splitted data </w:t>
                       </w:r>
                     </w:p>
                     <w:p>
@@ -7992,57 +7879,54 @@
     </w:p>
     <w:p/>
     <w:p>
-      <w:pPr>
-        <w:rPr>
-          <w:color w:val="EE0000"/>
-          <w:lang w:val="nb-NO"/>
-        </w:rPr>
-      </w:pPr>
-      <w:r>
-        <w:rPr>
-          <w:color w:val="EE0000"/>
-          <w:lang w:val="nb-NO"/>
-        </w:rPr>
-        <w:t xml:space="preserve">To </w:t>
-      </w:r>
-      <w:proofErr w:type="spellStart"/>
-      <w:r>
-        <w:rPr>
-          <w:color w:val="EE0000"/>
-          <w:lang w:val="nb-NO"/>
-        </w:rPr>
-        <w:t>doo</w:t>
-      </w:r>
-      <w:proofErr w:type="spellEnd"/>
-      <w:r>
-        <w:rPr>
-          <w:color w:val="EE0000"/>
-          <w:lang w:val="nb-NO"/>
-        </w:rPr>
-        <w:t xml:space="preserve"> skriv hvorfor </w:t>
-      </w:r>
-      <w:proofErr w:type="spellStart"/>
-      <w:r>
-        <w:rPr>
-          <w:color w:val="EE0000"/>
-          <w:lang w:val="nb-NO"/>
-        </w:rPr>
-        <w:t>slitting</w:t>
-      </w:r>
-      <w:proofErr w:type="spellEnd"/>
-      <w:r>
-        <w:rPr>
-          <w:color w:val="EE0000"/>
-          <w:lang w:val="nb-NO"/>
-        </w:rPr>
-        <w:t xml:space="preserve"> er viktig!!!</w:t>
+      <w:r>
+        <w:t xml:space="preserve">When building predictive </w:t>
+      </w:r>
+      <w:proofErr w:type="gramStart"/>
+      <w:r>
+        <w:t>models</w:t>
+      </w:r>
+      <w:proofErr w:type="gramEnd"/>
+      <w:r>
+        <w:t xml:space="preserve"> it is important to evaluate performance on data the model has never seen before. When we split the dataset into training and testing sets, we ensure that the model is fitted only on the training data and evaluated on an independent dataset. This prevents the model from memorizing the training data and gives a realistic estimate of how it will generalize to unseen data.</w:t>
+      </w:r>
+    </w:p>
+    <w:p>
+      <w:r>
+        <w:t xml:space="preserve">Overfitting occurs when a model not only captures the true patterns, but also the random noise in the training data. This makes the model perform very well on the training </w:t>
+      </w:r>
+      <w:proofErr w:type="gramStart"/>
+      <w:r>
+        <w:t>set, but</w:t>
+      </w:r>
+      <w:proofErr w:type="gramEnd"/>
+      <w:r>
+        <w:t xml:space="preserve"> fails to generalize </w:t>
+      </w:r>
+      <w:proofErr w:type="gramStart"/>
+      <w:r>
+        <w:t>to</w:t>
+      </w:r>
+      <w:proofErr w:type="gramEnd"/>
+      <w:r>
+        <w:t xml:space="preserve"> new data. When we split the </w:t>
+      </w:r>
+      <w:proofErr w:type="gramStart"/>
+      <w:r>
+        <w:t>data</w:t>
+      </w:r>
+      <w:proofErr w:type="gramEnd"/>
+      <w:r>
+        <w:t xml:space="preserve"> we can detect overfitting by </w:t>
+      </w:r>
+      <w:r>
+        <w:t>comparing the performance on the training set and test set.</w:t>
       </w:r>
     </w:p>
     <w:p>
       <w:pPr>
         <w:rPr>
           <w:color w:val="EE0000"/>
-          <w:lang w:val="nb-NO"/>
         </w:rPr>
       </w:pPr>
     </w:p>
@@ -8050,37 +7934,19 @@
       <w:pPr>
         <w:rPr>
           <w:color w:val="EE0000"/>
-          <w:lang w:val="nb-NO"/>
         </w:rPr>
       </w:pPr>
     </w:p>
     <w:p>
       <w:pPr>
         <w:pStyle w:val="Overskrift1"/>
-        <w:rPr>
-          <w:lang w:val="nb-NO"/>
-        </w:rPr>
       </w:pPr>
       <w:bookmarkStart w:id="6" w:name="_Toc208850140"/>
-      <w:proofErr w:type="spellStart"/>
-      <w:r>
-        <w:rPr>
-          <w:lang w:val="nb-NO"/>
-        </w:rPr>
-        <w:t>Task</w:t>
-      </w:r>
-      <w:proofErr w:type="spellEnd"/>
-      <w:r>
-        <w:rPr>
-          <w:lang w:val="nb-NO"/>
-        </w:rPr>
-        <w:t xml:space="preserve"> 6)</w:t>
+      <w:r>
+        <w:t>Task 6)</w:t>
       </w:r>
       <w:bookmarkEnd w:id="6"/>
       <w:r>
-        <w:rPr>
-          <w:lang w:val="nb-NO"/>
-        </w:rPr>
         <w:t xml:space="preserve"> </w:t>
       </w:r>
     </w:p>
@@ -8471,7 +8337,7 @@
       <w:headerReference w:type="default" r:id="rId59"/>
       <w:footerReference w:type="default" r:id="rId60"/>
       <w:pgSz w:w="11900" w:h="16840"/>
-      <w:pgMar w:top="1417" w:right="1417" w:bottom="1417" w:left="1417" w:header="708" w:footer="708" w:gutter="0"/>
+      <w:pgMar w:top="1134" w:right="1134" w:bottom="1134" w:left="1134" w:header="709" w:footer="709" w:gutter="0"/>
       <w:cols w:space="708"/>
       <w:docGrid w:linePitch="360"/>
     </w:sectPr>
@@ -9637,9 +9503,33 @@
       <w:color w:val="4472C4" w:themeColor="accent1"/>
     </w:rPr>
   </w:style>
+  <w:style w:type="paragraph" w:styleId="Overskrift4">
+    <w:name w:val="heading 4"/>
+    <w:basedOn w:val="Normal"/>
+    <w:next w:val="Normal"/>
+    <w:link w:val="Overskrift4Tegn"/>
+    <w:uiPriority w:val="9"/>
+    <w:semiHidden/>
+    <w:unhideWhenUsed/>
+    <w:qFormat/>
+    <w:rsid w:val="00696C69"/>
+    <w:pPr>
+      <w:keepNext/>
+      <w:keepLines/>
+      <w:spacing w:before="40" w:after="0"/>
+      <w:outlineLvl w:val="3"/>
+    </w:pPr>
+    <w:rPr>
+      <w:rFonts w:asciiTheme="majorHAnsi" w:eastAsiaTheme="majorEastAsia" w:hAnsiTheme="majorHAnsi" w:cstheme="majorBidi"/>
+      <w:i/>
+      <w:iCs/>
+      <w:color w:val="2F5496" w:themeColor="accent1" w:themeShade="BF"/>
+    </w:rPr>
+  </w:style>
   <w:style w:type="character" w:default="1" w:styleId="Standardskriftforavsnitt">
     <w:name w:val="Default Paragraph Font"/>
     <w:uiPriority w:val="1"/>
+    <w:semiHidden/>
     <w:unhideWhenUsed/>
   </w:style>
   <w:style w:type="table" w:default="1" w:styleId="Vanligtabell">
@@ -10417,6 +10307,23 @@
       <w:contextualSpacing/>
     </w:pPr>
   </w:style>
+  <w:style w:type="character" w:customStyle="1" w:styleId="Overskrift4Tegn">
+    <w:name w:val="Overskrift 4 Tegn"/>
+    <w:basedOn w:val="Standardskriftforavsnitt"/>
+    <w:link w:val="Overskrift4"/>
+    <w:uiPriority w:val="9"/>
+    <w:semiHidden/>
+    <w:rsid w:val="00696C69"/>
+    <w:rPr>
+      <w:rFonts w:asciiTheme="majorHAnsi" w:eastAsiaTheme="majorEastAsia" w:hAnsiTheme="majorHAnsi" w:cstheme="majorBidi"/>
+      <w:i/>
+      <w:iCs/>
+      <w:color w:val="2F5496" w:themeColor="accent1" w:themeShade="BF"/>
+      <w:sz w:val="22"/>
+      <w:szCs w:val="22"/>
+      <w:lang w:val="en-US"/>
+    </w:rPr>
+  </w:style>
 </w:styles>
 </file>
 

</xml_diff>